<commit_message>
chore: establish code ownership and sync repository structure
</commit_message>
<xml_diff>
--- a/docs/references/originals/final-repository-tree.docx
+++ b/docs/references/originals/final-repository-tree.docx
@@ -111,7 +111,25 @@
           <w:szCs w:val="20"/>
           <w:rtl w:val="0"/>
         </w:rPr>
-        <w:t xml:space="preserve">    │   └── bug-report.md</w:t>
+        <w:t xml:space="preserve">    │   └── </w:t>
+      </w:r>
+      <w:r>
+        <w:rPr>
+          <w:sz w:val="20"/>
+          <w:szCs w:val="20"/>
+          <w:rtl w:val="0"/>
+        </w:rPr>
+        <w:t xml:space="preserve">bug</w:t>
+      </w:r>
+      <w:r>
+        <w:rPr>
+          <w:sz w:val="20"/>
+          <w:szCs w:val="20"/>
+          <w:rtl w:val="0"/>
+        </w:rPr>
+        <w:t xml:space="preserve">-report.md</w:t>
+        <w:br w:type="textWrapping"/>
+        <w:t xml:space="preserve">    ├── CODEOWNERS</w:t>
       </w:r>
     </w:p>
     <w:p>

</xml_diff>

<commit_message>
chore: establish repository code ownership
* chore: resolve foundation audit findings

* chore: establish code ownership and sync repository structure
</commit_message>
<xml_diff>
--- a/docs/references/originals/final-repository-tree.docx
+++ b/docs/references/originals/final-repository-tree.docx
@@ -111,7 +111,25 @@
           <w:szCs w:val="20"/>
           <w:rtl w:val="0"/>
         </w:rPr>
-        <w:t xml:space="preserve">    │   └── bug-report.md</w:t>
+        <w:t xml:space="preserve">    │   └── </w:t>
+      </w:r>
+      <w:r>
+        <w:rPr>
+          <w:sz w:val="20"/>
+          <w:szCs w:val="20"/>
+          <w:rtl w:val="0"/>
+        </w:rPr>
+        <w:t xml:space="preserve">bug</w:t>
+      </w:r>
+      <w:r>
+        <w:rPr>
+          <w:sz w:val="20"/>
+          <w:szCs w:val="20"/>
+          <w:rtl w:val="0"/>
+        </w:rPr>
+        <w:t xml:space="preserve">-report.md</w:t>
+        <w:br w:type="textWrapping"/>
+        <w:t xml:space="preserve">    ├── CODEOWNERS</w:t>
       </w:r>
     </w:p>
     <w:p>

</xml_diff>